<commit_message>
Added smoke test for my website.
</commit_message>
<xml_diff>
--- a/Cloud Resume Challenge Blog.docx
+++ b/Cloud Resume Challenge Blog.docx
@@ -1085,16 +1085,14 @@
         </w:rPr>
         <w:t xml:space="preserve">After setting up CORS in S3 and Lambda it was time to finally finish configuring the CORS in my API Gateway. The first thing I did was to go to my count endpoint and click on the enable CORS tab. Once in the Enable CORS page I clicked on OPTIONS and POST check box and then </w:t>
       </w:r>
-      <w:proofErr w:type="spellStart"/>
       <w:r>
         <w:rPr>
           <w:rStyle w:val="hljs-string"/>
           <w:sz w:val="32"/>
           <w:szCs w:val="32"/>
         </w:rPr>
-        <w:t>chaged</w:t>
-      </w:r>
-      <w:proofErr w:type="spellEnd"/>
+        <w:t>changed</w:t>
+      </w:r>
       <w:r>
         <w:rPr>
           <w:rStyle w:val="hljs-string"/>
@@ -1103,16 +1101,14 @@
         </w:rPr>
         <w:t xml:space="preserve"> my ACCESS-CONTROL-ALLOW-ORGIN from * to my website chrisweise.com. After I had done this the next </w:t>
       </w:r>
-      <w:proofErr w:type="gramStart"/>
       <w:r>
         <w:rPr>
           <w:rStyle w:val="hljs-string"/>
           <w:sz w:val="32"/>
           <w:szCs w:val="32"/>
         </w:rPr>
-        <w:t>thing</w:t>
-      </w:r>
-      <w:proofErr w:type="gramEnd"/>
+        <w:t>thing,</w:t>
+      </w:r>
       <w:r>
         <w:rPr>
           <w:rStyle w:val="hljs-string"/>

</xml_diff>